<commit_message>
Resume: Cyber Security Analyst @ Unknown (unknown)
</commit_message>
<xml_diff>
--- a/resumes/Resume_Cyber_Security_Analyst_Unknown__unknown_.docx
+++ b/resumes/Resume_Cyber_Security_Analyst_Unknown__unknown_.docx
@@ -4,7 +4,7 @@
   <w:body>
     <w:p>
       <w:pPr>
-        <w:spacing w:after="44"/>
+        <w:spacing w:after="0" w:before="20"/>
         <w:jc w:val="center"/>
       </w:pPr>
       <w:r>
@@ -21,6 +21,7 @@
     </w:p>
     <w:p>
       <w:pPr>
+        <w:spacing w:before="20" w:after="0"/>
         <w:jc w:val="center"/>
       </w:pPr>
       <w:r>
@@ -116,7 +117,7 @@
         <w:pBdr>
           <w:bottom w:val="single" w:sz="6" w:space="1" w:color="000000"/>
         </w:pBdr>
-        <w:spacing w:before="360" w:after="52"/>
+        <w:spacing w:before="128" w:after="0"/>
       </w:pPr>
       <w:r>
         <w:rPr>
@@ -135,7 +136,7 @@
         <w:tabs>
           <w:tab w:val="right" w:pos="10800"/>
         </w:tabs>
-        <w:spacing w:before="62"/>
+        <w:spacing w:before="20" w:after="0"/>
       </w:pPr>
       <w:r>
         <w:rPr>
@@ -159,6 +160,8 @@
       <w:r>
         <w:rPr>
           <w:rFonts w:ascii="Source Sans Pro" w:eastAsia="Source Sans Pro" w:hAnsi="Source Sans Pro" w:cs="Source Sans Pro"/>
+          <w:i/>
+          <w:iCs/>
           <w:color w:val="555555"/>
           <w:sz w:val="19"/>
           <w:szCs w:val="19"/>
@@ -168,7 +171,7 @@
     </w:p>
     <w:p>
       <w:pPr>
-        <w:spacing w:before="8"/>
+        <w:spacing w:before="8" w:after="0"/>
       </w:pPr>
       <w:r>
         <w:rPr>
@@ -187,7 +190,7 @@
         <w:tabs>
           <w:tab w:val="right" w:pos="10800"/>
         </w:tabs>
-        <w:spacing w:before="62"/>
+        <w:spacing w:before="20" w:after="0"/>
       </w:pPr>
       <w:r>
         <w:rPr>
@@ -211,6 +214,8 @@
       <w:r>
         <w:rPr>
           <w:rFonts w:ascii="Source Sans Pro" w:eastAsia="Source Sans Pro" w:hAnsi="Source Sans Pro" w:cs="Source Sans Pro"/>
+          <w:i/>
+          <w:iCs/>
           <w:color w:val="555555"/>
           <w:sz w:val="19"/>
           <w:szCs w:val="19"/>
@@ -220,7 +225,7 @@
     </w:p>
     <w:p>
       <w:pPr>
-        <w:spacing w:before="8"/>
+        <w:spacing w:before="8" w:after="0"/>
       </w:pPr>
       <w:r>
         <w:rPr>
@@ -239,7 +244,7 @@
         <w:tabs>
           <w:tab w:val="right" w:pos="10800"/>
         </w:tabs>
-        <w:spacing w:before="62"/>
+        <w:spacing w:before="20" w:after="0"/>
       </w:pPr>
       <w:r>
         <w:rPr>
@@ -263,6 +268,8 @@
       <w:r>
         <w:rPr>
           <w:rFonts w:ascii="Source Sans Pro" w:eastAsia="Source Sans Pro" w:hAnsi="Source Sans Pro" w:cs="Source Sans Pro"/>
+          <w:i/>
+          <w:iCs/>
           <w:color w:val="555555"/>
           <w:sz w:val="19"/>
           <w:szCs w:val="19"/>
@@ -272,7 +279,7 @@
     </w:p>
     <w:p>
       <w:pPr>
-        <w:spacing w:before="8"/>
+        <w:spacing w:before="8" w:after="0"/>
       </w:pPr>
       <w:r>
         <w:rPr>
@@ -288,7 +295,7 @@
     </w:p>
     <w:p>
       <w:pPr>
-        <w:spacing w:before="8"/>
+        <w:spacing w:before="27" w:after="27"/>
       </w:pPr>
     </w:p>
     <w:p>
@@ -296,7 +303,7 @@
         <w:pBdr>
           <w:bottom w:val="single" w:sz="6" w:space="1" w:color="000000"/>
         </w:pBdr>
-        <w:spacing w:before="155" w:after="52"/>
+        <w:spacing w:before="128" w:after="0"/>
       </w:pPr>
       <w:r>
         <w:rPr>
@@ -315,7 +322,7 @@
         <w:tabs>
           <w:tab w:val="right" w:pos="10800"/>
         </w:tabs>
-        <w:spacing w:before="62"/>
+        <w:spacing w:before="20" w:after="0"/>
       </w:pPr>
       <w:r>
         <w:rPr>
@@ -347,6 +354,8 @@
       <w:r>
         <w:rPr>
           <w:rFonts w:ascii="Source Sans Pro" w:eastAsia="Source Sans Pro" w:hAnsi="Source Sans Pro" w:cs="Source Sans Pro"/>
+          <w:i/>
+          <w:iCs/>
           <w:color w:val="555555"/>
           <w:sz w:val="19"/>
           <w:szCs w:val="19"/>
@@ -359,11 +368,18 @@
         <w:tabs>
           <w:tab w:val="right" w:pos="10800"/>
         </w:tabs>
-        <w:spacing w:before="8"/>
-      </w:pPr>
-      <w:r>
-        <w:rPr>
-          <w:rFonts w:ascii="Source Sans Pro" w:eastAsia="Source Sans Pro" w:hAnsi="Source Sans Pro" w:cs="Source Sans Pro"/>
+        <w:spacing w:before="8" w:after="0"/>
+        <w:rPr>
+          <w:rFonts w:ascii="Source Sans Pro Light" w:hAnsi="Source Sans Pro Light"/>
+          <w:i/>
+          <w:iCs/>
+        </w:rPr>
+      </w:pPr>
+      <w:r>
+        <w:rPr>
+          <w:rFonts w:ascii="Source Sans Pro" w:eastAsia="Source Sans Pro" w:hAnsi="Source Sans Pro" w:cs="Source Sans Pro"/>
+          <w:i/>
+          <w:iCs/>
           <w:color w:val="555555"/>
           <w:sz w:val="19"/>
           <w:szCs w:val="19"/>
@@ -389,6 +405,8 @@
       <w:r>
         <w:rPr>
           <w:rFonts w:ascii="Source Sans Pro" w:eastAsia="Source Sans Pro" w:hAnsi="Source Sans Pro" w:cs="Source Sans Pro"/>
+          <w:i/>
+          <w:iCs/>
           <w:color w:val="555555"/>
           <w:sz w:val="19"/>
           <w:szCs w:val="19"/>
@@ -403,34 +421,16 @@
           <w:ilvl w:val="0"/>
           <w:numId w:val="2"/>
         </w:numPr>
-        <w:spacing w:before="13" w:after="13"/>
-      </w:pPr>
-      <w:r>
-        <w:rPr>
-          <w:rFonts w:ascii="Source Sans Pro" w:eastAsia="Source Sans Pro" w:hAnsi="Source Sans Pro" w:cs="Source Sans Pro"/>
-          <w:color w:val="000000"/>
-          <w:sz w:val="19"/>
-          <w:szCs w:val="19"/>
-        </w:rPr>
-        <w:t>Triaged 50+ weekly inventory reimbursement cases by severity &amp; policy eligibility, mirroring SOC Tier 1 analyst workflow.</w:t>
-      </w:r>
-      <w:proofErr w:type="spellStart"/>
-      <w:r>
-        <w:rPr>
-          <w:rFonts w:ascii="Source Sans Pro" w:eastAsia="Source Sans Pro" w:hAnsi="Source Sans Pro" w:cs="Source Sans Pro"/>
-          <w:color w:val="000000"/>
-          <w:sz w:val="19"/>
-          <w:szCs w:val="19"/>
-        </w:rPr>
-      </w:r>
-      <w:proofErr w:type="spellEnd"/>
-      <w:r>
-        <w:rPr>
-          <w:rFonts w:ascii="Source Sans Pro" w:eastAsia="Source Sans Pro" w:hAnsi="Source Sans Pro" w:cs="Source Sans Pro"/>
-          <w:color w:val="000000"/>
-          <w:sz w:val="19"/>
-          <w:szCs w:val="19"/>
-        </w:rPr>
+        <w:spacing w:before="13" w:after="38"/>
+      </w:pPr>
+      <w:r>
+        <w:rPr>
+          <w:rFonts w:ascii="Source Sans Pro" w:eastAsia="Source Sans Pro" w:hAnsi="Source Sans Pro" w:cs="Source Sans Pro"/>
+          <w:color w:val="000000"/>
+          <w:sz w:val="19"/>
+          <w:szCs w:val="19"/>
+        </w:rPr>
+        <w:t>Triaged 50+ weekly inventory reimbursement cases by severity and policy eligibility, translating high-volume case review into structured investigation, escalation, and evidence documentation.</w:t>
       </w:r>
     </w:p>
     <w:p>
@@ -440,16 +440,16 @@
           <w:ilvl w:val="0"/>
           <w:numId w:val="2"/>
         </w:numPr>
-        <w:spacing w:before="13" w:after="13"/>
-      </w:pPr>
-      <w:r>
-        <w:rPr>
-          <w:rFonts w:ascii="Source Sans Pro" w:eastAsia="Source Sans Pro" w:hAnsi="Source Sans Pro" w:cs="Source Sans Pro"/>
-          <w:color w:val="000000"/>
-          <w:sz w:val="19"/>
-          <w:szCs w:val="19"/>
-        </w:rPr>
-        <w:t>Performed root cause analysis on seller claims to identify policy violations &amp; anomalous patterns; escalated findings to senior reviewers.</w:t>
+        <w:spacing w:before="13" w:after="38"/>
+      </w:pPr>
+      <w:r>
+        <w:rPr>
+          <w:rFonts w:ascii="Source Sans Pro" w:eastAsia="Source Sans Pro" w:hAnsi="Source Sans Pro" w:cs="Source Sans Pro"/>
+          <w:color w:val="000000"/>
+          <w:sz w:val="19"/>
+          <w:szCs w:val="19"/>
+        </w:rPr>
+        <w:t>Investigated seller claims, identifying policy violations and anomalous patterns, escalating findings to senior reviewers</w:t>
       </w:r>
     </w:p>
     <w:p>
@@ -459,91 +459,16 @@
           <w:ilvl w:val="0"/>
           <w:numId w:val="2"/>
         </w:numPr>
-        <w:spacing w:before="13" w:after="13"/>
-      </w:pPr>
-      <w:r>
-        <w:rPr>
-          <w:rFonts w:ascii="Source Sans Pro" w:eastAsia="Source Sans Pro" w:hAnsi="Source Sans Pro" w:cs="Source Sans Pro"/>
-          <w:color w:val="000000"/>
-          <w:sz w:val="19"/>
-          <w:szCs w:val="19"/>
-        </w:rPr>
-        <w:t>Maintained audit-ready case documentation recording investigation findings, decisions, &amp; corrective actions for security incident reporting.</w:t>
-      </w:r>
-    </w:p>
-    <w:p>
-      <w:pPr>
-        <w:pBdr>
-          <w:bottom w:val="single" w:sz="6" w:space="1" w:color="000000"/>
-        </w:pBdr>
-        <w:spacing w:before="155" w:after="52"/>
-        <w:rPr>
-          <w:rFonts w:ascii="Source Sans Pro" w:eastAsia="Source Sans Pro" w:hAnsi="Source Sans Pro" w:cs="Source Sans Pro"/>
-          <w:b/>
-          <w:bCs/>
-          <w:color w:val="000000"/>
-          <w:sz w:val="22"/>
-          <w:szCs w:val="22"/>
-        </w:rPr>
-      </w:pPr>
-    </w:p>
-    <w:p>
-      <w:pPr>
-        <w:pBdr>
-          <w:bottom w:val="single" w:sz="6" w:space="1" w:color="000000"/>
-        </w:pBdr>
-        <w:spacing w:before="155" w:after="52"/>
-      </w:pPr>
-      <w:r>
-        <w:rPr>
-          <w:rFonts w:ascii="Source Sans Pro" w:eastAsia="Source Sans Pro" w:hAnsi="Source Sans Pro" w:cs="Source Sans Pro"/>
-          <w:b/>
-          <w:bCs/>
-          <w:color w:val="000000"/>
-          <w:sz w:val="22"/>
-          <w:szCs w:val="22"/>
-        </w:rPr>
-        <w:t>Projects</w:t>
-      </w:r>
-    </w:p>
-    <w:p>
-      <w:pPr>
-        <w:tabs>
-          <w:tab w:val="right" w:pos="10800"/>
-        </w:tabs>
-        <w:spacing w:before="62"/>
-      </w:pPr>
-      <w:proofErr w:type="spellStart"/>
-      <w:proofErr w:type="spellEnd"/>
-      <w:hyperlink r:id="rId13">
-        <w:r>
-          <w:rPr>
-            <w:rFonts w:ascii="Source Sans Pro" w:eastAsia="Source Sans Pro" w:hAnsi="Source Sans Pro" w:cs="Source Sans Pro"/>
-            <w:b/>
-            <w:sz w:val="19"/>
-            <w:szCs w:val="19"/>
-            <w:color w:val="000000"/>
-            <w:u w:val="single"/>
-          </w:rPr>
-          <w:t>SOC Automation &amp; Threat Detection Lab</w:t>
-        </w:r>
-      </w:hyperlink>
-      <w:r>
-        <w:rPr>
-          <w:rFonts w:ascii="Source Sans Pro" w:eastAsia="Source Sans Pro" w:hAnsi="Source Sans Pro" w:cs="Source Sans Pro"/>
-          <w:sz w:val="19"/>
-          <w:szCs w:val="19"/>
-        </w:rPr>
-        <w:t xml:space="preserve">  |  	</w:t>
-      </w:r>
-      <w:r>
-        <w:rPr>
-          <w:rFonts w:ascii="Source Sans Pro" w:eastAsia="Source Sans Pro" w:hAnsi="Source Sans Pro" w:cs="Source Sans Pro"/>
-          <w:i/>
-          <w:sz w:val="19"/>
-          <w:szCs w:val="19"/>
-        </w:rPr>
-        <w:t>Python, Splunk, Wireshark, Nmap, MITRE ATT&amp;CK</w:t>
+        <w:spacing w:before="13" w:after="38"/>
+      </w:pPr>
+      <w:r>
+        <w:rPr>
+          <w:rFonts w:ascii="Source Sans Pro" w:eastAsia="Source Sans Pro" w:hAnsi="Source Sans Pro" w:cs="Source Sans Pro"/>
+          <w:color w:val="000000"/>
+          <w:sz w:val="19"/>
+          <w:szCs w:val="19"/>
+        </w:rPr>
+        <w:t>Maintained audit-ready case documentation with findings, decisions, evidence notes, and corrective actions aligned to evidence documentation and decision trails.</w:t>
       </w:r>
     </w:p>
     <w:p>
@@ -553,16 +478,98 @@
           <w:ilvl w:val="0"/>
           <w:numId w:val="2"/>
         </w:numPr>
-        <w:spacing w:before="13" w:after="13"/>
-      </w:pPr>
-      <w:r>
-        <w:rPr>
-          <w:rFonts w:ascii="Source Sans Pro" w:eastAsia="Source Sans Pro" w:hAnsi="Source Sans Pro" w:cs="Source Sans Pro"/>
-          <w:color w:val="000000"/>
-          <w:sz w:val="19"/>
-          <w:szCs w:val="19"/>
-        </w:rPr>
-        <w:t>Deployed Splunk SIEM with SPL correlation searches for brute-force detection, lateral movement, &amp; privilege escalation; mapped TTPs to MITRE ATT&amp;CK.</w:t>
+        <w:spacing w:before="13" w:after="38"/>
+      </w:pPr>
+      <w:r>
+        <w:rPr>
+          <w:rFonts w:ascii="Source Sans Pro" w:eastAsia="Source Sans Pro" w:hAnsi="Source Sans Pro" w:cs="Source Sans Pro"/>
+          <w:color w:val="000000"/>
+          <w:sz w:val="19"/>
+          <w:szCs w:val="19"/>
+        </w:rPr>
+        <w:t>Spotted recurring fraud patterns across 200+ weekly cases and flagged repeat issues early, reducing investigation cycles before escalation.</w:t>
+      </w:r>
+    </w:p>
+    <w:p>
+      <w:pPr>
+        <w:pBdr>
+          <w:bottom w:val="single" w:sz="6" w:space="1" w:color="000000"/>
+        </w:pBdr>
+        <w:spacing w:before="27" w:after="27"/>
+        <w:rPr>
+          <w:rFonts w:ascii="Source Sans Pro" w:eastAsia="Source Sans Pro" w:hAnsi="Source Sans Pro" w:cs="Source Sans Pro"/>
+          <w:b/>
+          <w:bCs/>
+          <w:color w:val="000000"/>
+          <w:sz w:val="22"/>
+          <w:szCs w:val="22"/>
+        </w:rPr>
+      </w:pPr>
+    </w:p>
+    <w:p>
+      <w:pPr>
+        <w:pBdr>
+          <w:bottom w:val="single" w:sz="6" w:space="1" w:color="000000"/>
+        </w:pBdr>
+        <w:spacing w:before="128" w:after="0"/>
+      </w:pPr>
+      <w:r>
+        <w:rPr>
+          <w:rFonts w:ascii="Source Sans Pro" w:eastAsia="Source Sans Pro" w:hAnsi="Source Sans Pro" w:cs="Source Sans Pro"/>
+          <w:b/>
+          <w:bCs/>
+          <w:color w:val="000000"/>
+          <w:sz w:val="22"/>
+          <w:szCs w:val="22"/>
+        </w:rPr>
+        <w:t>Projects</w:t>
+      </w:r>
+    </w:p>
+    <w:p>
+      <w:pPr>
+        <w:tabs>
+          <w:tab w:val="right" w:pos="10800"/>
+        </w:tabs>
+        <w:spacing w:before="20" w:after="0"/>
+      </w:pPr>
+      <w:hyperlink r:id="rId8">
+        <w:r>
+          <w:rPr>
+            <w:rFonts w:ascii="Source Sans Pro" w:eastAsia="Source Sans Pro" w:hAnsi="Source Sans Pro" w:cs="Source Sans Pro"/>
+            <w:b/>
+            <w:color w:val="000000"/>
+            <w:sz w:val="19"/>
+            <w:szCs w:val="19"/>
+            <w:u w:val="single"/>
+          </w:rPr>
+          <w:t>SOC Automation and Threat Detection Lab</w:t>
+        </w:r>
+      </w:hyperlink>
+      <w:r>
+        <w:rPr>
+          <w:rFonts w:ascii="Source Sans Pro" w:eastAsia="Source Sans Pro" w:hAnsi="Source Sans Pro" w:cs="Source Sans Pro"/>
+          <w:sz w:val="19"/>
+          <w:szCs w:val="19"/>
+        </w:rPr>
+        <w:t xml:space="preserve">  |  </w:t>
+      </w:r>
+      <w:r>
+        <w:rPr>
+          <w:rFonts w:ascii="Source Sans Pro" w:eastAsia="Source Sans Pro" w:hAnsi="Source Sans Pro" w:cs="Source Sans Pro"/>
+          <w:sz w:val="19"/>
+          <w:szCs w:val="19"/>
+        </w:rPr>
+        <w:tab/>
+      </w:r>
+      <w:r>
+        <w:rPr>
+          <w:rFonts w:ascii="Source Sans Pro Light" w:eastAsia="Source Sans Pro" w:hAnsi="Source Sans Pro Light" w:cs="Source Sans Pro"/>
+          <w:i/>
+          <w:iCs/>
+          <w:sz w:val="19"/>
+          <w:szCs w:val="19"/>
+        </w:rPr>
+        <w:t>Python, Splunk, Wireshark, Nmap, MITRE ATT&amp;CK</w:t>
       </w:r>
     </w:p>
     <w:p>
@@ -572,16 +579,16 @@
           <w:ilvl w:val="0"/>
           <w:numId w:val="2"/>
         </w:numPr>
-        <w:spacing w:before="13" w:after="13"/>
-      </w:pPr>
-      <w:r>
-        <w:rPr>
-          <w:rFonts w:ascii="Source Sans Pro" w:eastAsia="Source Sans Pro" w:hAnsi="Source Sans Pro" w:cs="Source Sans Pro"/>
-          <w:color w:val="000000"/>
-          <w:sz w:val="19"/>
-          <w:szCs w:val="19"/>
-        </w:rPr>
-        <w:t>Built automated SOAR-style detection pipeline: Python script ingests Splunk alerts, runs IOC enrichment via VirusTotal API, &amp; dispatches Telegram notifications.</w:t>
+        <w:spacing w:before="13" w:after="38"/>
+      </w:pPr>
+      <w:r>
+        <w:rPr>
+          <w:rFonts w:ascii="Source Sans Pro" w:eastAsia="Source Sans Pro" w:hAnsi="Source Sans Pro" w:cs="Source Sans Pro"/>
+          <w:color w:val="000000"/>
+          <w:sz w:val="19"/>
+          <w:szCs w:val="19"/>
+        </w:rPr>
+        <w:t>Deployed Splunk SIEM with SPL correlation for brute-force detection, mapped TTPs to MITRE ATT&amp;CK and wrote PICERL incident report.</w:t>
       </w:r>
     </w:p>
     <w:p>
@@ -591,95 +598,16 @@
           <w:ilvl w:val="0"/>
           <w:numId w:val="2"/>
         </w:numPr>
-        <w:spacing w:before="13" w:after="13"/>
-      </w:pPr>
-      <w:r>
-        <w:rPr>
-          <w:rFonts w:ascii="Source Sans Pro" w:eastAsia="Source Sans Pro" w:hAnsi="Source Sans Pro" w:cs="Source Sans Pro"/>
-          <w:color w:val="000000"/>
-          <w:sz w:val="19"/>
-          <w:szCs w:val="19"/>
-        </w:rPr>
-        <w:t>Converted detection logic to Sigma rules; performed TCP/IP analysis in Wireshark to detect SYN scans, DNS tunnelling, &amp; plaintext credential exposure.</w:t>
-      </w:r>
-      <w:proofErr w:type="spellStart"/>
-      <w:r>
-        <w:rPr>
-          <w:rFonts w:ascii="Source Sans Pro" w:eastAsia="Source Sans Pro" w:hAnsi="Source Sans Pro" w:cs="Source Sans Pro"/>
-          <w:color w:val="000000"/>
-          <w:sz w:val="19"/>
-          <w:szCs w:val="19"/>
-        </w:rPr>
-      </w:r>
-      <w:proofErr w:type="spellEnd"/>
-      <w:r>
-        <w:rPr>
-          <w:rFonts w:ascii="Source Sans Pro" w:eastAsia="Source Sans Pro" w:hAnsi="Source Sans Pro" w:cs="Source Sans Pro"/>
-          <w:color w:val="000000"/>
-          <w:sz w:val="19"/>
-          <w:szCs w:val="19"/>
-        </w:rPr>
-      </w:r>
-      <w:proofErr w:type="spellStart"/>
-      <w:r>
-        <w:rPr>
-          <w:rFonts w:ascii="Source Sans Pro" w:eastAsia="Source Sans Pro" w:hAnsi="Source Sans Pro" w:cs="Source Sans Pro"/>
-          <w:color w:val="000000"/>
-          <w:sz w:val="19"/>
-          <w:szCs w:val="19"/>
-        </w:rPr>
-      </w:r>
-      <w:proofErr w:type="spellEnd"/>
-      <w:r>
-        <w:rPr>
-          <w:rFonts w:ascii="Source Sans Pro" w:eastAsia="Source Sans Pro" w:hAnsi="Source Sans Pro" w:cs="Source Sans Pro"/>
-          <w:color w:val="000000"/>
-          <w:sz w:val="19"/>
-          <w:szCs w:val="19"/>
-        </w:rPr>
-      </w:r>
-    </w:p>
-    <w:p>
-      <w:pPr>
-        <w:spacing w:before="30"/>
-      </w:pPr>
-    </w:p>
-    <w:p>
-      <w:pPr>
-        <w:tabs>
-          <w:tab w:val="right" w:pos="10800"/>
-        </w:tabs>
-        <w:spacing w:before="30"/>
-      </w:pPr>
-      <w:hyperlink r:id="rId14">
-        <w:r>
-          <w:rPr>
-            <w:rFonts w:ascii="Source Sans Pro" w:eastAsia="Source Sans Pro" w:hAnsi="Source Sans Pro" w:cs="Source Sans Pro"/>
-            <w:b/>
-            <w:sz w:val="19"/>
-            <w:szCs w:val="19"/>
-            <w:color w:val="000000"/>
-            <w:u w:val="single"/>
-          </w:rPr>
-          <w:t>Vulnerability Scanner &amp; Patch Prioritization Engine</w:t>
-        </w:r>
-      </w:hyperlink>
-      <w:r>
-        <w:rPr>
-          <w:rFonts w:ascii="Source Sans Pro" w:eastAsia="Source Sans Pro" w:hAnsi="Source Sans Pro" w:cs="Source Sans Pro"/>
-          <w:sz w:val="19"/>
-          <w:szCs w:val="19"/>
-        </w:rPr>
-        <w:t xml:space="preserve">  |  	</w:t>
-      </w:r>
-      <w:r>
-        <w:rPr>
-          <w:rFonts w:ascii="Source Sans Pro" w:eastAsia="Source Sans Pro" w:hAnsi="Source Sans Pro" w:cs="Source Sans Pro"/>
-          <w:i/>
-          <w:sz w:val="19"/>
-          <w:szCs w:val="19"/>
-        </w:rPr>
-        <w:t>Python, Bash, Nessus, OpenVAS, NVD API</w:t>
+        <w:spacing w:before="36" w:after="36"/>
+      </w:pPr>
+      <w:r>
+        <w:rPr>
+          <w:rFonts w:ascii="Source Sans Pro" w:eastAsia="Source Sans Pro" w:hAnsi="Source Sans Pro" w:cs="Source Sans Pro"/>
+          <w:color w:val="000000"/>
+          <w:sz w:val="19"/>
+          <w:szCs w:val="19"/>
+        </w:rPr>
+        <w:t>Built SOAR pipeline: Python script ingests Splunk alerts, runs IOC enrichment via VirusTotal API, and dispatches Telegram notifications.</w:t>
       </w:r>
     </w:p>
     <w:p>
@@ -689,16 +617,68 @@
           <w:ilvl w:val="0"/>
           <w:numId w:val="2"/>
         </w:numPr>
-        <w:spacing w:before="13" w:after="13"/>
-      </w:pPr>
-      <w:r>
-        <w:rPr>
-          <w:rFonts w:ascii="Source Sans Pro" w:eastAsia="Source Sans Pro" w:hAnsi="Source Sans Pro" w:cs="Source Sans Pro"/>
-          <w:color w:val="000000"/>
-          <w:sz w:val="19"/>
-          <w:szCs w:val="19"/>
-        </w:rPr>
-        <w:t>Built automated vulnerability assessment pipeline integrating Nessus &amp; OpenVAS REST APIs in Python; generates CVE reports classified by CVSS severity.</w:t>
+        <w:spacing w:before="13" w:after="38"/>
+      </w:pPr>
+      <w:r>
+        <w:rPr>
+          <w:rFonts w:ascii="Source Sans Pro" w:eastAsia="Source Sans Pro" w:hAnsi="Source Sans Pro" w:cs="Source Sans Pro"/>
+          <w:color w:val="000000"/>
+          <w:sz w:val="19"/>
+          <w:szCs w:val="19"/>
+        </w:rPr>
+        <w:t>Converted detection logic to Sigma rules, analyzed TCP/IP in Wireshark to detect scans and plaintext credential exposure.</w:t>
+      </w:r>
+    </w:p>
+    <w:p>
+      <w:pPr>
+        <w:spacing w:before="27" w:after="27"/>
+      </w:pPr>
+    </w:p>
+    <w:p>
+      <w:pPr>
+        <w:tabs>
+          <w:tab w:val="right" w:pos="10800"/>
+        </w:tabs>
+        <w:spacing w:before="30" w:after="0"/>
+      </w:pPr>
+      <w:hyperlink r:id="rId9">
+        <w:r>
+          <w:rPr>
+            <w:rFonts w:ascii="Source Sans Pro" w:eastAsia="Source Sans Pro" w:hAnsi="Source Sans Pro" w:cs="Source Sans Pro"/>
+            <w:b/>
+            <w:color w:val="000000"/>
+            <w:sz w:val="19"/>
+            <w:szCs w:val="19"/>
+            <w:u w:val="single"/>
+          </w:rPr>
+          <w:t>Vulnerability Scanner and Patch Prioritization Engine</w:t>
+        </w:r>
+      </w:hyperlink>
+      <w:r>
+        <w:rPr>
+          <w:rFonts w:ascii="Source Sans Pro" w:eastAsia="Source Sans Pro" w:hAnsi="Source Sans Pro" w:cs="Source Sans Pro"/>
+          <w:sz w:val="19"/>
+          <w:szCs w:val="19"/>
+        </w:rPr>
+        <w:t xml:space="preserve">  |  </w:t>
+      </w:r>
+      <w:r>
+        <w:rPr>
+          <w:rFonts w:ascii="Source Sans Pro" w:eastAsia="Source Sans Pro" w:hAnsi="Source Sans Pro" w:cs="Source Sans Pro"/>
+          <w:sz w:val="19"/>
+          <w:szCs w:val="19"/>
+        </w:rPr>
+        <w:tab/>
+      </w:r>
+      <w:r>
+        <w:rPr>
+          <w:rFonts w:ascii="Source Sans Pro Light" w:eastAsia="Source Sans Pro" w:hAnsi="Source Sans Pro Light" w:cs="Source Sans Pro"/>
+          <w:i/>
+          <w:iCs/>
+          <w:sz w:val="19"/>
+          <w:szCs w:val="19"/>
+        </w:rPr>
+        <w:t>Python, Bash, Nessus, OpenVAS, NVD API</w:t>
       </w:r>
     </w:p>
     <w:p>
@@ -708,16 +688,16 @@
           <w:ilvl w:val="0"/>
           <w:numId w:val="2"/>
         </w:numPr>
-        <w:spacing w:before="13" w:after="13"/>
-      </w:pPr>
-      <w:r>
-        <w:rPr>
-          <w:rFonts w:ascii="Source Sans Pro" w:eastAsia="Source Sans Pro" w:hAnsi="Source Sans Pro" w:cs="Source Sans Pro"/>
-          <w:color w:val="000000"/>
-          <w:sz w:val="19"/>
-          <w:szCs w:val="19"/>
-        </w:rPr>
-        <w:t>Developed OWASP Top 10 automated web checker that sends crafted HTTP requests to test targets &amp; detects injection, broken auth, &amp; SSRF vulnerabilities.</w:t>
+        <w:spacing w:before="13" w:after="38"/>
+      </w:pPr>
+      <w:r>
+        <w:rPr>
+          <w:rFonts w:ascii="Source Sans Pro" w:eastAsia="Source Sans Pro" w:hAnsi="Source Sans Pro" w:cs="Source Sans Pro"/>
+          <w:color w:val="000000"/>
+          <w:sz w:val="19"/>
+          <w:szCs w:val="19"/>
+        </w:rPr>
+        <w:t>Automated vulnerability pipeline using Nessus and OpenVAS APIs, generating CVE reports with CVSS severity, EPSS context and SOAR detail from FIRST.org API</w:t>
       </w:r>
     </w:p>
     <w:p>
@@ -727,196 +707,16 @@
           <w:ilvl w:val="0"/>
           <w:numId w:val="2"/>
         </w:numPr>
-        <w:spacing w:before="13" w:after="13"/>
-      </w:pPr>
-      <w:r>
-        <w:rPr>
-          <w:rFonts w:ascii="Source Sans Pro" w:eastAsia="Source Sans Pro" w:hAnsi="Source Sans Pro" w:cs="Source Sans Pro"/>
-          <w:color w:val="000000"/>
-          <w:sz w:val="19"/>
-          <w:szCs w:val="19"/>
-        </w:rPr>
-        <w:t>Automated scan scheduling via Bash &amp; cron; built delta-scan logic comparing consecutive runs to flag newly discovered CVEs &amp; calculate remediation SLA deadlines.</w:t>
-      </w:r>
-    </w:p>
-    <w:p>
-      <w:pPr>
-        <w:pBdr>
-          <w:bottom w:val="single" w:sz="6" w:space="1" w:color="000000"/>
-        </w:pBdr>
-        <w:spacing w:before="155" w:after="52"/>
-        <w:rPr>
-          <w:rFonts w:ascii="Source Sans Pro" w:eastAsia="Source Sans Pro" w:hAnsi="Source Sans Pro" w:cs="Source Sans Pro"/>
-          <w:b/>
-          <w:bCs/>
-          <w:color w:val="000000"/>
-          <w:sz w:val="22"/>
-          <w:szCs w:val="22"/>
-        </w:rPr>
-      </w:pPr>
-    </w:p>
-    <w:p>
-      <w:pPr>
-        <w:pBdr>
-          <w:bottom w:val="single" w:sz="6" w:space="1" w:color="000000"/>
-        </w:pBdr>
-        <w:spacing w:before="155" w:after="52"/>
-      </w:pPr>
-      <w:r>
-        <w:rPr>
-          <w:rFonts w:ascii="Source Sans Pro" w:eastAsia="Source Sans Pro" w:hAnsi="Source Sans Pro" w:cs="Source Sans Pro"/>
-          <w:b/>
-          <w:bCs/>
-          <w:color w:val="000000"/>
-          <w:sz w:val="22"/>
-          <w:szCs w:val="22"/>
-        </w:rPr>
-        <w:t>Technical Skills</w:t>
-      </w:r>
-    </w:p>
-    <w:p>
-      <w:pPr>
-        <w:spacing w:before="24" w:after="24"/>
-      </w:pPr>
-      <w:r>
-        <w:rPr>
-          <w:rFonts w:ascii="Source Sans Pro" w:eastAsia="Source Sans Pro" w:hAnsi="Source Sans Pro" w:cs="Source Sans Pro"/>
-          <w:b/>
-          <w:sz w:val="19"/>
-          <w:szCs w:val="19"/>
-        </w:rPr>
-        <w:t xml:space="preserve">SOC Operations: </w:t>
-      </w:r>
-      <w:r>
-        <w:rPr>
-          <w:rFonts w:ascii="Source Sans Pro" w:eastAsia="Source Sans Pro" w:hAnsi="Source Sans Pro" w:cs="Source Sans Pro"/>
-          <w:sz w:val="19"/>
-          <w:szCs w:val="19"/>
-        </w:rPr>
-        <w:t>Alert triage, incident investigation, log analysis, threat detection, escalation, false positive analysis</w:t>
-      </w:r>
-    </w:p>
-    <w:p>
-      <w:pPr>
-        <w:spacing w:before="24" w:after="24"/>
-      </w:pPr>
-      <w:r>
-        <w:rPr>
-          <w:rFonts w:ascii="Source Sans Pro" w:eastAsia="Source Sans Pro" w:hAnsi="Source Sans Pro" w:cs="Source Sans Pro"/>
-          <w:b/>
-          <w:sz w:val="19"/>
-          <w:szCs w:val="19"/>
-        </w:rPr>
-        <w:t xml:space="preserve">SIEM &amp; Monitoring: </w:t>
-      </w:r>
-      <w:r>
-        <w:rPr>
-          <w:rFonts w:ascii="Source Sans Pro" w:eastAsia="Source Sans Pro" w:hAnsi="Source Sans Pro" w:cs="Source Sans Pro"/>
-          <w:sz w:val="19"/>
-          <w:szCs w:val="19"/>
-        </w:rPr>
-        <w:t>Splunk (SPL), Elastic SIEM (basic), Windows Event Logs, Sysmon, Wireshark</w:t>
-      </w:r>
-    </w:p>
-    <w:p>
-      <w:pPr>
-        <w:spacing w:before="24" w:after="24"/>
-      </w:pPr>
-      <w:r>
-        <w:rPr>
-          <w:rFonts w:ascii="Source Sans Pro" w:eastAsia="Source Sans Pro" w:hAnsi="Source Sans Pro" w:cs="Source Sans Pro"/>
-          <w:b/>
-          <w:sz w:val="19"/>
-          <w:szCs w:val="19"/>
-        </w:rPr>
-        <w:t xml:space="preserve">Threat Intelligence: </w:t>
-      </w:r>
-      <w:r>
-        <w:rPr>
-          <w:rFonts w:ascii="Source Sans Pro" w:eastAsia="Source Sans Pro" w:hAnsi="Source Sans Pro" w:cs="Source Sans Pro"/>
-          <w:sz w:val="19"/>
-          <w:szCs w:val="19"/>
-        </w:rPr>
-        <w:t>MITRE ATT&amp;CK, IOC analysis, VirusTotal, OSINT enrichment, Cyber Kill Chain</w:t>
-      </w:r>
-    </w:p>
-    <w:p>
-      <w:pPr>
-        <w:spacing w:before="24" w:after="24"/>
-      </w:pPr>
-      <w:r>
-        <w:rPr>
-          <w:rFonts w:ascii="Source Sans Pro" w:eastAsia="Source Sans Pro" w:hAnsi="Source Sans Pro" w:cs="Source Sans Pro"/>
-          <w:b/>
-          <w:sz w:val="19"/>
-          <w:szCs w:val="19"/>
-        </w:rPr>
-        <w:t xml:space="preserve">Systems &amp; Networking: </w:t>
-      </w:r>
-      <w:r>
-        <w:rPr>
-          <w:rFonts w:ascii="Source Sans Pro" w:eastAsia="Source Sans Pro" w:hAnsi="Source Sans Pro" w:cs="Source Sans Pro"/>
-          <w:sz w:val="19"/>
-          <w:szCs w:val="19"/>
-        </w:rPr>
-        <w:t>Windows internals, Linux fundamentals, TCP/IP, DNS, HTTP/S, firewall and IDS/IPS concepts</w:t>
-      </w:r>
-    </w:p>
-    <w:p>
-      <w:pPr>
-        <w:spacing w:before="24" w:after="24"/>
-      </w:pPr>
-      <w:r>
-        <w:rPr>
-          <w:rFonts w:ascii="Source Sans Pro" w:eastAsia="Source Sans Pro" w:hAnsi="Source Sans Pro" w:cs="Source Sans Pro"/>
-          <w:b/>
-          <w:sz w:val="19"/>
-          <w:szCs w:val="19"/>
-        </w:rPr>
-        <w:t xml:space="preserve">Automation: </w:t>
-      </w:r>
-      <w:r>
-        <w:rPr>
-          <w:rFonts w:ascii="Source Sans Pro" w:eastAsia="Source Sans Pro" w:hAnsi="Source Sans Pro" w:cs="Source Sans Pro"/>
-          <w:sz w:val="19"/>
-          <w:szCs w:val="19"/>
-        </w:rPr>
-        <w:t>Python, Bash (basic), regular expressions</w:t>
-      </w:r>
-    </w:p>
-    <w:p>
-      <w:pPr>
-        <w:pBdr>
-          <w:bottom w:val="single" w:sz="6" w:space="1" w:color="000000"/>
-        </w:pBdr>
-        <w:spacing w:before="155" w:after="52"/>
-        <w:rPr>
-          <w:rFonts w:ascii="Source Sans Pro" w:eastAsia="Source Sans Pro" w:hAnsi="Source Sans Pro" w:cs="Source Sans Pro"/>
-          <w:b/>
-          <w:bCs/>
-          <w:color w:val="000000"/>
-          <w:sz w:val="22"/>
-          <w:szCs w:val="22"/>
-        </w:rPr>
-      </w:pPr>
-    </w:p>
-    <w:p>
-      <w:pPr>
-        <w:pBdr>
-          <w:bottom w:val="single" w:sz="6" w:space="1" w:color="000000"/>
-        </w:pBdr>
-        <w:spacing w:before="155" w:after="52"/>
-      </w:pPr>
-      <w:r>
-        <w:rPr>
-          <w:rFonts w:ascii="Source Sans Pro" w:eastAsia="Source Sans Pro" w:hAnsi="Source Sans Pro" w:cs="Source Sans Pro"/>
-          <w:b/>
-          <w:bCs/>
-          <w:color w:val="000000"/>
-          <w:sz w:val="22"/>
-          <w:szCs w:val="22"/>
-        </w:rPr>
-        <w:t>Certifications</w:t>
+        <w:spacing w:before="13" w:after="38"/>
+      </w:pPr>
+      <w:r>
+        <w:rPr>
+          <w:rFonts w:ascii="Source Sans Pro" w:eastAsia="Source Sans Pro" w:hAnsi="Source Sans Pro" w:cs="Source Sans Pro"/>
+          <w:color w:val="000000"/>
+          <w:sz w:val="19"/>
+          <w:szCs w:val="19"/>
+        </w:rPr>
+        <w:t>Developed web checker for OWASP Top 10 vulnerabilities and documented SQL injection remediation.</w:t>
       </w:r>
     </w:p>
     <w:p>
@@ -926,16 +726,196 @@
           <w:ilvl w:val="0"/>
           <w:numId w:val="2"/>
         </w:numPr>
-        <w:spacing w:before="13" w:after="13"/>
-      </w:pPr>
-      <w:r>
-        <w:rPr>
-          <w:rFonts w:ascii="Source Sans Pro" w:eastAsia="Source Sans Pro" w:hAnsi="Source Sans Pro" w:cs="Source Sans Pro"/>
-          <w:color w:val="000000"/>
-          <w:sz w:val="19"/>
-          <w:szCs w:val="19"/>
-        </w:rPr>
-        <w:t>CompTIA Security+ SY0-701  —  in progress, exam target Q3 2026</w:t>
+        <w:spacing w:before="13" w:after="38"/>
+      </w:pPr>
+      <w:r>
+        <w:rPr>
+          <w:rFonts w:ascii="Source Sans Pro" w:eastAsia="Source Sans Pro" w:hAnsi="Source Sans Pro" w:cs="Source Sans Pro"/>
+          <w:color w:val="000000"/>
+          <w:sz w:val="19"/>
+          <w:szCs w:val="19"/>
+        </w:rPr>
+        <w:t>Automated scan scheduling via Bash and cron; built delta-scan logic to flag newly discovered CVEs and organize patch compliance (remediation tracking) tracking evidence with audit evidence creation.</w:t>
+      </w:r>
+    </w:p>
+    <w:p>
+      <w:pPr>
+        <w:pBdr>
+          <w:bottom w:val="single" w:sz="6" w:space="1" w:color="000000"/>
+        </w:pBdr>
+        <w:spacing w:before="27" w:after="27"/>
+        <w:rPr>
+          <w:rFonts w:ascii="Source Sans Pro" w:eastAsia="Source Sans Pro" w:hAnsi="Source Sans Pro" w:cs="Source Sans Pro"/>
+          <w:b/>
+          <w:bCs/>
+          <w:color w:val="000000"/>
+          <w:sz w:val="22"/>
+          <w:szCs w:val="22"/>
+        </w:rPr>
+      </w:pPr>
+    </w:p>
+    <w:p>
+      <w:pPr>
+        <w:pBdr>
+          <w:bottom w:val="single" w:sz="6" w:space="1" w:color="000000"/>
+        </w:pBdr>
+        <w:spacing w:before="128" w:after="0"/>
+      </w:pPr>
+      <w:r>
+        <w:rPr>
+          <w:rFonts w:ascii="Source Sans Pro" w:eastAsia="Source Sans Pro" w:hAnsi="Source Sans Pro" w:cs="Source Sans Pro"/>
+          <w:b/>
+          <w:bCs/>
+          <w:color w:val="000000"/>
+          <w:sz w:val="22"/>
+          <w:szCs w:val="22"/>
+        </w:rPr>
+        <w:t>Technical Skills</w:t>
+      </w:r>
+    </w:p>
+    <w:p>
+      <w:pPr>
+        <w:spacing w:before="47" w:after="47"/>
+      </w:pPr>
+      <w:r>
+        <w:rPr>
+          <w:rFonts w:ascii="Source Sans Pro" w:eastAsia="Source Sans Pro" w:hAnsi="Source Sans Pro" w:cs="Source Sans Pro"/>
+          <w:b/>
+          <w:sz w:val="19"/>
+          <w:szCs w:val="19"/>
+        </w:rPr>
+        <w:t xml:space="preserve">SOC Operations: </w:t>
+      </w:r>
+      <w:r>
+        <w:rPr>
+          <w:rFonts w:ascii="Source Sans Pro" w:eastAsia="Source Sans Pro" w:hAnsi="Source Sans Pro" w:cs="Source Sans Pro"/>
+          <w:sz w:val="19"/>
+          <w:szCs w:val="19"/>
+        </w:rPr>
+        <w:t>Alert triage, incident investigation, log analysis, threat detection, escalation, false positive analysis</w:t>
+      </w:r>
+    </w:p>
+    <w:p>
+      <w:pPr>
+        <w:spacing w:before="47" w:after="47"/>
+      </w:pPr>
+      <w:r>
+        <w:rPr>
+          <w:rFonts w:ascii="Source Sans Pro" w:eastAsia="Source Sans Pro" w:hAnsi="Source Sans Pro" w:cs="Source Sans Pro"/>
+          <w:b/>
+          <w:sz w:val="19"/>
+          <w:szCs w:val="19"/>
+        </w:rPr>
+        <w:t xml:space="preserve">SIEM &amp; Monitoring: </w:t>
+      </w:r>
+      <w:r>
+        <w:rPr>
+          <w:rFonts w:ascii="Source Sans Pro" w:eastAsia="Source Sans Pro" w:hAnsi="Source Sans Pro" w:cs="Source Sans Pro"/>
+          <w:sz w:val="19"/>
+          <w:szCs w:val="19"/>
+        </w:rPr>
+        <w:t>Splunk (SPL), Elastic SIEM (basic), Windows Event Logs, Sysmon, Wireshark</w:t>
+      </w:r>
+    </w:p>
+    <w:p>
+      <w:pPr>
+        <w:spacing w:before="47" w:after="47"/>
+      </w:pPr>
+      <w:r>
+        <w:rPr>
+          <w:rFonts w:ascii="Source Sans Pro" w:eastAsia="Source Sans Pro" w:hAnsi="Source Sans Pro" w:cs="Source Sans Pro"/>
+          <w:b/>
+          <w:sz w:val="19"/>
+          <w:szCs w:val="19"/>
+        </w:rPr>
+        <w:t xml:space="preserve">Threat Intelligence: </w:t>
+      </w:r>
+      <w:r>
+        <w:rPr>
+          <w:rFonts w:ascii="Source Sans Pro" w:eastAsia="Source Sans Pro" w:hAnsi="Source Sans Pro" w:cs="Source Sans Pro"/>
+          <w:sz w:val="19"/>
+          <w:szCs w:val="19"/>
+        </w:rPr>
+        <w:t>MITRE ATT&amp;CK, IOC analysis, VirusTotal, OSINT enrichment, Cyber Kill Chain</w:t>
+      </w:r>
+    </w:p>
+    <w:p>
+      <w:pPr>
+        <w:spacing w:before="47" w:after="47"/>
+      </w:pPr>
+      <w:r>
+        <w:rPr>
+          <w:rFonts w:ascii="Source Sans Pro" w:eastAsia="Source Sans Pro" w:hAnsi="Source Sans Pro" w:cs="Source Sans Pro"/>
+          <w:b/>
+          <w:sz w:val="19"/>
+          <w:szCs w:val="19"/>
+        </w:rPr>
+        <w:t xml:space="preserve">Systems &amp; Networking: </w:t>
+      </w:r>
+      <w:r>
+        <w:rPr>
+          <w:rFonts w:ascii="Source Sans Pro" w:eastAsia="Source Sans Pro" w:hAnsi="Source Sans Pro" w:cs="Source Sans Pro"/>
+          <w:sz w:val="19"/>
+          <w:szCs w:val="19"/>
+        </w:rPr>
+        <w:t>Windows internals, Linux fundamentals, TCP/IP, DNS, HTTP/S, firewall and IDS/IPS concepts</w:t>
+      </w:r>
+    </w:p>
+    <w:p>
+      <w:pPr>
+        <w:spacing w:before="47" w:after="47"/>
+      </w:pPr>
+      <w:r>
+        <w:rPr>
+          <w:rFonts w:ascii="Source Sans Pro" w:eastAsia="Source Sans Pro" w:hAnsi="Source Sans Pro" w:cs="Source Sans Pro"/>
+          <w:b/>
+          <w:sz w:val="19"/>
+          <w:szCs w:val="19"/>
+        </w:rPr>
+        <w:t xml:space="preserve">Automation: </w:t>
+      </w:r>
+      <w:r>
+        <w:rPr>
+          <w:rFonts w:ascii="Source Sans Pro" w:eastAsia="Source Sans Pro" w:hAnsi="Source Sans Pro" w:cs="Source Sans Pro"/>
+          <w:sz w:val="19"/>
+          <w:szCs w:val="19"/>
+        </w:rPr>
+        <w:t>Python, Bash (basic), regular expressions, security</w:t>
+      </w:r>
+    </w:p>
+    <w:p>
+      <w:pPr>
+        <w:pBdr>
+          <w:bottom w:val="single" w:sz="6" w:space="1" w:color="000000"/>
+        </w:pBdr>
+        <w:spacing w:before="27" w:after="27"/>
+        <w:rPr>
+          <w:rFonts w:ascii="Source Sans Pro" w:eastAsia="Source Sans Pro" w:hAnsi="Source Sans Pro" w:cs="Source Sans Pro"/>
+          <w:b/>
+          <w:bCs/>
+          <w:color w:val="000000"/>
+          <w:sz w:val="22"/>
+          <w:szCs w:val="22"/>
+        </w:rPr>
+      </w:pPr>
+    </w:p>
+    <w:p>
+      <w:pPr>
+        <w:pBdr>
+          <w:bottom w:val="single" w:sz="6" w:space="1" w:color="000000"/>
+        </w:pBdr>
+        <w:spacing w:before="128" w:after="0"/>
+      </w:pPr>
+      <w:r>
+        <w:rPr>
+          <w:rFonts w:ascii="Source Sans Pro" w:eastAsia="Source Sans Pro" w:hAnsi="Source Sans Pro" w:cs="Source Sans Pro"/>
+          <w:b/>
+          <w:bCs/>
+          <w:color w:val="000000"/>
+          <w:sz w:val="22"/>
+          <w:szCs w:val="22"/>
+        </w:rPr>
+        <w:t>Certifications</w:t>
       </w:r>
     </w:p>
     <w:p>
@@ -945,7 +925,26 @@
           <w:ilvl w:val="0"/>
           <w:numId w:val="2"/>
         </w:numPr>
-        <w:spacing w:before="13" w:after="13"/>
+        <w:spacing w:before="13" w:after="38"/>
+      </w:pPr>
+      <w:r>
+        <w:rPr>
+          <w:rFonts w:ascii="Source Sans Pro" w:eastAsia="Source Sans Pro" w:hAnsi="Source Sans Pro" w:cs="Source Sans Pro"/>
+          <w:color w:val="000000"/>
+          <w:sz w:val="19"/>
+          <w:szCs w:val="19"/>
+        </w:rPr>
+        <w:t>CompTIA Security+ SY0-701  —  in progress, exam target Q3 2026</w:t>
+      </w:r>
+    </w:p>
+    <w:p>
+      <w:pPr>
+        <w:pStyle w:val="ListParagraph"/>
+        <w:numPr>
+          <w:ilvl w:val="0"/>
+          <w:numId w:val="2"/>
+        </w:numPr>
+        <w:spacing w:before="13" w:after="38"/>
       </w:pPr>
       <w:r>
         <w:rPr>

</xml_diff>